<commit_message>
Agregue Manual_de_usuario.pdf y README.md
</commit_message>
<xml_diff>
--- a/Equipo_3_act_2.1_pensamiento_creativo_2.docx
+++ b/Equipo_3_act_2.1_pensamiento_creativo_2.docx
@@ -1154,7 +1154,7 @@
         </w:rPr>
         <w:fldChar w:fldCharType="separate"/>
       </w:r>
-      <w:hyperlink w:anchor="_Toc241766444" w:history="1">
+      <w:hyperlink w:anchor="_Toc241937909" w:history="1">
         <w:r>
           <w:rPr>
             <w:rStyle w:val="Hipervnculo"/>
@@ -1181,7 +1181,7 @@
             <w:noProof/>
             <w:webHidden/>
           </w:rPr>
-          <w:instrText xml:space="preserve"> PAGEREF _Toc241766444 \h </w:instrText>
+          <w:instrText xml:space="preserve"> PAGEREF _Toc241937909 \h </w:instrText>
         </w:r>
         <w:r>
           <w:rPr>
@@ -1201,7 +1201,7 @@
             <w:noProof/>
             <w:webHidden/>
           </w:rPr>
-          <w:t>4</w:t>
+          <w:t>3</w:t>
         </w:r>
         <w:r>
           <w:rPr>
@@ -1226,7 +1226,7 @@
           <w:lang w:val="es-MX" w:eastAsia="es-MX" w:bidi="ar-SA"/>
         </w:rPr>
       </w:pPr>
-      <w:hyperlink w:anchor="_Toc241766445" w:history="1">
+      <w:hyperlink w:anchor="_Toc241937910" w:history="1">
         <w:r>
           <w:rPr>
             <w:rStyle w:val="Hipervnculo"/>
@@ -1253,7 +1253,7 @@
             <w:noProof/>
             <w:webHidden/>
           </w:rPr>
-          <w:instrText xml:space="preserve"> PAGEREF _Toc241766445 \h </w:instrText>
+          <w:instrText xml:space="preserve"> PAGEREF _Toc241937910 \h </w:instrText>
         </w:r>
         <w:r>
           <w:rPr>
@@ -1273,7 +1273,7 @@
             <w:noProof/>
             <w:webHidden/>
           </w:rPr>
-          <w:t>4</w:t>
+          <w:t>3</w:t>
         </w:r>
         <w:r>
           <w:rPr>
@@ -1298,7 +1298,7 @@
           <w:lang w:val="es-MX" w:eastAsia="es-MX" w:bidi="ar-SA"/>
         </w:rPr>
       </w:pPr>
-      <w:hyperlink w:anchor="_Toc241766446" w:history="1">
+      <w:hyperlink w:anchor="_Toc241937911" w:history="1">
         <w:r>
           <w:rPr>
             <w:rStyle w:val="Hipervnculo"/>
@@ -1326,7 +1326,7 @@
             <w:noProof/>
             <w:webHidden/>
           </w:rPr>
-          <w:instrText xml:space="preserve"> PAGEREF _Toc241766446 \h </w:instrText>
+          <w:instrText xml:space="preserve"> PAGEREF _Toc241937911 \h </w:instrText>
         </w:r>
         <w:r>
           <w:rPr>
@@ -1346,7 +1346,7 @@
             <w:noProof/>
             <w:webHidden/>
           </w:rPr>
-          <w:t>4</w:t>
+          <w:t>3</w:t>
         </w:r>
         <w:r>
           <w:rPr>
@@ -1371,7 +1371,7 @@
           <w:lang w:val="es-MX" w:eastAsia="es-MX" w:bidi="ar-SA"/>
         </w:rPr>
       </w:pPr>
-      <w:hyperlink w:anchor="_Toc241766447" w:history="1">
+      <w:hyperlink w:anchor="_Toc241937912" w:history="1">
         <w:r>
           <w:rPr>
             <w:rStyle w:val="Hipervnculo"/>
@@ -1399,7 +1399,7 @@
             <w:noProof/>
             <w:webHidden/>
           </w:rPr>
-          <w:instrText xml:space="preserve"> PAGEREF _Toc241766447 \h </w:instrText>
+          <w:instrText xml:space="preserve"> PAGEREF _Toc241937912 \h </w:instrText>
         </w:r>
         <w:r>
           <w:rPr>
@@ -1444,7 +1444,7 @@
           <w:lang w:val="es-MX" w:eastAsia="es-MX" w:bidi="ar-SA"/>
         </w:rPr>
       </w:pPr>
-      <w:hyperlink w:anchor="_Toc241766448" w:history="1">
+      <w:hyperlink w:anchor="_Toc241937913" w:history="1">
         <w:r>
           <w:rPr>
             <w:rStyle w:val="Hipervnculo"/>
@@ -1472,7 +1472,7 @@
             <w:noProof/>
             <w:webHidden/>
           </w:rPr>
-          <w:instrText xml:space="preserve"> PAGEREF _Toc241766448 \h </w:instrText>
+          <w:instrText xml:space="preserve"> PAGEREF _Toc241937913 \h </w:instrText>
         </w:r>
         <w:r>
           <w:rPr>
@@ -1492,7 +1492,7 @@
             <w:noProof/>
             <w:webHidden/>
           </w:rPr>
-          <w:t>5</w:t>
+          <w:t>4</w:t>
         </w:r>
         <w:r>
           <w:rPr>
@@ -1517,7 +1517,7 @@
           <w:lang w:val="es-MX" w:eastAsia="es-MX" w:bidi="ar-SA"/>
         </w:rPr>
       </w:pPr>
-      <w:hyperlink w:anchor="_Toc241766449" w:history="1">
+      <w:hyperlink w:anchor="_Toc241937914" w:history="1">
         <w:r>
           <w:rPr>
             <w:rStyle w:val="Hipervnculo"/>
@@ -1545,7 +1545,7 @@
             <w:noProof/>
             <w:webHidden/>
           </w:rPr>
-          <w:instrText xml:space="preserve"> PAGEREF _Toc241766449 \h </w:instrText>
+          <w:instrText xml:space="preserve"> PAGEREF _Toc241937914 \h </w:instrText>
         </w:r>
         <w:r>
           <w:rPr>
@@ -1565,7 +1565,7 @@
             <w:noProof/>
             <w:webHidden/>
           </w:rPr>
-          <w:t>5</w:t>
+          <w:t>4</w:t>
         </w:r>
         <w:r>
           <w:rPr>
@@ -1590,7 +1590,7 @@
           <w:lang w:val="es-MX" w:eastAsia="es-MX" w:bidi="ar-SA"/>
         </w:rPr>
       </w:pPr>
-      <w:hyperlink w:anchor="_Toc241766450" w:history="1">
+      <w:hyperlink w:anchor="_Toc241937915" w:history="1">
         <w:r>
           <w:rPr>
             <w:rStyle w:val="Hipervnculo"/>
@@ -1618,7 +1618,7 @@
             <w:noProof/>
             <w:webHidden/>
           </w:rPr>
-          <w:instrText xml:space="preserve"> PAGEREF _Toc241766450 \h </w:instrText>
+          <w:instrText xml:space="preserve"> PAGEREF _Toc241937915 \h </w:instrText>
         </w:r>
         <w:r>
           <w:rPr>
@@ -1663,7 +1663,7 @@
           <w:lang w:val="es-MX" w:eastAsia="es-MX" w:bidi="ar-SA"/>
         </w:rPr>
       </w:pPr>
-      <w:hyperlink w:anchor="_Toc241766451" w:history="1">
+      <w:hyperlink w:anchor="_Toc241937916" w:history="1">
         <w:r>
           <w:rPr>
             <w:rStyle w:val="Hipervnculo"/>
@@ -1691,7 +1691,7 @@
             <w:noProof/>
             <w:webHidden/>
           </w:rPr>
-          <w:instrText xml:space="preserve"> PAGEREF _Toc241766451 \h </w:instrText>
+          <w:instrText xml:space="preserve"> PAGEREF _Toc241937916 \h </w:instrText>
         </w:r>
         <w:r>
           <w:rPr>
@@ -1736,7 +1736,7 @@
           <w:lang w:val="es-MX" w:eastAsia="es-MX" w:bidi="ar-SA"/>
         </w:rPr>
       </w:pPr>
-      <w:hyperlink w:anchor="_Toc241766452" w:history="1">
+      <w:hyperlink w:anchor="_Toc241937917" w:history="1">
         <w:r>
           <w:rPr>
             <w:rStyle w:val="Hipervnculo"/>
@@ -1764,7 +1764,7 @@
             <w:noProof/>
             <w:webHidden/>
           </w:rPr>
-          <w:instrText xml:space="preserve"> PAGEREF _Toc241766452 \h </w:instrText>
+          <w:instrText xml:space="preserve"> PAGEREF _Toc241937917 \h </w:instrText>
         </w:r>
         <w:r>
           <w:rPr>
@@ -1809,7 +1809,7 @@
           <w:lang w:val="es-MX" w:eastAsia="es-MX" w:bidi="ar-SA"/>
         </w:rPr>
       </w:pPr>
-      <w:hyperlink w:anchor="_Toc241766453" w:history="1">
+      <w:hyperlink w:anchor="_Toc241937918" w:history="1">
         <w:r>
           <w:rPr>
             <w:rStyle w:val="Hipervnculo"/>
@@ -1837,7 +1837,7 @@
             <w:noProof/>
             <w:webHidden/>
           </w:rPr>
-          <w:instrText xml:space="preserve"> PAGEREF _Toc241766453 \h </w:instrText>
+          <w:instrText xml:space="preserve"> PAGEREF _Toc241937918 \h </w:instrText>
         </w:r>
         <w:r>
           <w:rPr>
@@ -1857,7 +1857,7 @@
             <w:noProof/>
             <w:webHidden/>
           </w:rPr>
-          <w:t>6</w:t>
+          <w:t>5</w:t>
         </w:r>
         <w:r>
           <w:rPr>
@@ -1882,7 +1882,7 @@
           <w:lang w:val="es-MX" w:eastAsia="es-MX" w:bidi="ar-SA"/>
         </w:rPr>
       </w:pPr>
-      <w:hyperlink w:anchor="_Toc241766454" w:history="1">
+      <w:hyperlink w:anchor="_Toc241937919" w:history="1">
         <w:r>
           <w:rPr>
             <w:rStyle w:val="Hipervnculo"/>
@@ -1910,7 +1910,7 @@
             <w:noProof/>
             <w:webHidden/>
           </w:rPr>
-          <w:instrText xml:space="preserve"> PAGEREF _Toc241766454 \h </w:instrText>
+          <w:instrText xml:space="preserve"> PAGEREF _Toc241937919 \h </w:instrText>
         </w:r>
         <w:r>
           <w:rPr>
@@ -1930,7 +1930,7 @@
             <w:noProof/>
             <w:webHidden/>
           </w:rPr>
-          <w:t>6</w:t>
+          <w:t>5</w:t>
         </w:r>
         <w:r>
           <w:rPr>
@@ -1955,7 +1955,7 @@
           <w:lang w:val="es-MX" w:eastAsia="es-MX" w:bidi="ar-SA"/>
         </w:rPr>
       </w:pPr>
-      <w:hyperlink w:anchor="_Toc241766455" w:history="1">
+      <w:hyperlink w:anchor="_Toc241937920" w:history="1">
         <w:r>
           <w:rPr>
             <w:rStyle w:val="Hipervnculo"/>
@@ -1983,7 +1983,7 @@
             <w:noProof/>
             <w:webHidden/>
           </w:rPr>
-          <w:instrText xml:space="preserve"> PAGEREF _Toc241766455 \h </w:instrText>
+          <w:instrText xml:space="preserve"> PAGEREF _Toc241937920 \h </w:instrText>
         </w:r>
         <w:r>
           <w:rPr>
@@ -2003,7 +2003,7 @@
             <w:noProof/>
             <w:webHidden/>
           </w:rPr>
-          <w:t>6</w:t>
+          <w:t>5</w:t>
         </w:r>
         <w:r>
           <w:rPr>
@@ -2028,7 +2028,7 @@
           <w:lang w:val="es-MX" w:eastAsia="es-MX" w:bidi="ar-SA"/>
         </w:rPr>
       </w:pPr>
-      <w:hyperlink w:anchor="_Toc241766456" w:history="1">
+      <w:hyperlink w:anchor="_Toc241937921" w:history="1">
         <w:r>
           <w:rPr>
             <w:rStyle w:val="Hipervnculo"/>
@@ -2056,7 +2056,7 @@
             <w:noProof/>
             <w:webHidden/>
           </w:rPr>
-          <w:instrText xml:space="preserve"> PAGEREF _Toc241766456 \h </w:instrText>
+          <w:instrText xml:space="preserve"> PAGEREF _Toc241937921 \h </w:instrText>
         </w:r>
         <w:r>
           <w:rPr>
@@ -2101,7 +2101,7 @@
           <w:lang w:val="es-MX" w:eastAsia="es-MX" w:bidi="ar-SA"/>
         </w:rPr>
       </w:pPr>
-      <w:hyperlink w:anchor="_Toc241766457" w:history="1">
+      <w:hyperlink w:anchor="_Toc241937922" w:history="1">
         <w:r>
           <w:rPr>
             <w:rStyle w:val="Hipervnculo"/>
@@ -2129,7 +2129,7 @@
             <w:noProof/>
             <w:webHidden/>
           </w:rPr>
-          <w:instrText xml:space="preserve"> PAGEREF _Toc241766457 \h </w:instrText>
+          <w:instrText xml:space="preserve"> PAGEREF _Toc241937922 \h </w:instrText>
         </w:r>
         <w:r>
           <w:rPr>
@@ -2174,7 +2174,7 @@
           <w:lang w:val="es-MX" w:eastAsia="es-MX" w:bidi="ar-SA"/>
         </w:rPr>
       </w:pPr>
-      <w:hyperlink w:anchor="_Toc241766458" w:history="1">
+      <w:hyperlink w:anchor="_Toc241937923" w:history="1">
         <w:r>
           <w:rPr>
             <w:rStyle w:val="Hipervnculo"/>
@@ -2202,7 +2202,7 @@
             <w:noProof/>
             <w:webHidden/>
           </w:rPr>
-          <w:instrText xml:space="preserve"> PAGEREF _Toc241766458 \h </w:instrText>
+          <w:instrText xml:space="preserve"> PAGEREF _Toc241937923 \h </w:instrText>
         </w:r>
         <w:r>
           <w:rPr>
@@ -2247,7 +2247,7 @@
           <w:lang w:val="es-MX" w:eastAsia="es-MX" w:bidi="ar-SA"/>
         </w:rPr>
       </w:pPr>
-      <w:hyperlink w:anchor="_Toc241766459" w:history="1">
+      <w:hyperlink w:anchor="_Toc241937924" w:history="1">
         <w:r>
           <w:rPr>
             <w:rStyle w:val="Hipervnculo"/>
@@ -2275,7 +2275,7 @@
             <w:noProof/>
             <w:webHidden/>
           </w:rPr>
-          <w:instrText xml:space="preserve"> PAGEREF _Toc241766459 \h </w:instrText>
+          <w:instrText xml:space="preserve"> PAGEREF _Toc241937924 \h </w:instrText>
         </w:r>
         <w:r>
           <w:rPr>
@@ -2295,7 +2295,7 @@
             <w:noProof/>
             <w:webHidden/>
           </w:rPr>
-          <w:t>7</w:t>
+          <w:t>6</w:t>
         </w:r>
         <w:r>
           <w:rPr>
@@ -2320,7 +2320,7 @@
           <w:lang w:val="es-MX" w:eastAsia="es-MX" w:bidi="ar-SA"/>
         </w:rPr>
       </w:pPr>
-      <w:hyperlink w:anchor="_Toc241766460" w:history="1">
+      <w:hyperlink w:anchor="_Toc241937925" w:history="1">
         <w:r>
           <w:rPr>
             <w:rStyle w:val="Hipervnculo"/>
@@ -2347,7 +2347,7 @@
             <w:noProof/>
             <w:webHidden/>
           </w:rPr>
-          <w:instrText xml:space="preserve"> PAGEREF _Toc241766460 \h </w:instrText>
+          <w:instrText xml:space="preserve"> PAGEREF _Toc241937925 \h </w:instrText>
         </w:r>
         <w:r>
           <w:rPr>
@@ -2367,7 +2367,7 @@
             <w:noProof/>
             <w:webHidden/>
           </w:rPr>
-          <w:t>8</w:t>
+          <w:t>7</w:t>
         </w:r>
         <w:r>
           <w:rPr>
@@ -2392,7 +2392,7 @@
           <w:lang w:val="es-MX" w:eastAsia="es-MX" w:bidi="ar-SA"/>
         </w:rPr>
       </w:pPr>
-      <w:hyperlink w:anchor="_Toc241766461" w:history="1">
+      <w:hyperlink w:anchor="_Toc241937926" w:history="1">
         <w:r>
           <w:rPr>
             <w:rStyle w:val="Hipervnculo"/>
@@ -2420,7 +2420,7 @@
             <w:noProof/>
             <w:webHidden/>
           </w:rPr>
-          <w:instrText xml:space="preserve"> PAGEREF _Toc241766461 \h </w:instrText>
+          <w:instrText xml:space="preserve"> PAGEREF _Toc241937926 \h </w:instrText>
         </w:r>
         <w:r>
           <w:rPr>
@@ -2440,7 +2440,7 @@
             <w:noProof/>
             <w:webHidden/>
           </w:rPr>
-          <w:t>8</w:t>
+          <w:t>7</w:t>
         </w:r>
         <w:r>
           <w:rPr>
@@ -2465,7 +2465,7 @@
           <w:lang w:val="es-MX" w:eastAsia="es-MX" w:bidi="ar-SA"/>
         </w:rPr>
       </w:pPr>
-      <w:hyperlink w:anchor="_Toc241766462" w:history="1">
+      <w:hyperlink w:anchor="_Toc241937927" w:history="1">
         <w:r>
           <w:rPr>
             <w:rStyle w:val="Hipervnculo"/>
@@ -2493,7 +2493,7 @@
             <w:noProof/>
             <w:webHidden/>
           </w:rPr>
-          <w:instrText xml:space="preserve"> PAGEREF _Toc241766462 \h </w:instrText>
+          <w:instrText xml:space="preserve"> PAGEREF _Toc241937927 \h </w:instrText>
         </w:r>
         <w:r>
           <w:rPr>
@@ -2513,7 +2513,7 @@
             <w:noProof/>
             <w:webHidden/>
           </w:rPr>
-          <w:t>8</w:t>
+          <w:t>7</w:t>
         </w:r>
         <w:r>
           <w:rPr>
@@ -2538,7 +2538,7 @@
           <w:lang w:val="es-MX" w:eastAsia="es-MX" w:bidi="ar-SA"/>
         </w:rPr>
       </w:pPr>
-      <w:hyperlink w:anchor="_Toc241766463" w:history="1">
+      <w:hyperlink w:anchor="_Toc241937928" w:history="1">
         <w:r>
           <w:rPr>
             <w:rStyle w:val="Hipervnculo"/>
@@ -2566,7 +2566,7 @@
             <w:noProof/>
             <w:webHidden/>
           </w:rPr>
-          <w:instrText xml:space="preserve"> PAGEREF _Toc241766463 \h </w:instrText>
+          <w:instrText xml:space="preserve"> PAGEREF _Toc241937928 \h </w:instrText>
         </w:r>
         <w:r>
           <w:rPr>
@@ -2586,7 +2586,7 @@
             <w:noProof/>
             <w:webHidden/>
           </w:rPr>
-          <w:t>9</w:t>
+          <w:t>8</w:t>
         </w:r>
         <w:r>
           <w:rPr>
@@ -2611,7 +2611,7 @@
           <w:lang w:val="es-MX" w:eastAsia="es-MX" w:bidi="ar-SA"/>
         </w:rPr>
       </w:pPr>
-      <w:hyperlink w:anchor="_Toc241766464" w:history="1">
+      <w:hyperlink w:anchor="_Toc241937929" w:history="1">
         <w:r>
           <w:rPr>
             <w:rStyle w:val="Hipervnculo"/>
@@ -2638,7 +2638,7 @@
             <w:noProof/>
             <w:webHidden/>
           </w:rPr>
-          <w:instrText xml:space="preserve"> PAGEREF _Toc241766464 \h </w:instrText>
+          <w:instrText xml:space="preserve"> PAGEREF _Toc241937929 \h </w:instrText>
         </w:r>
         <w:r>
           <w:rPr>
@@ -2658,7 +2658,7 @@
             <w:noProof/>
             <w:webHidden/>
           </w:rPr>
-          <w:t>9</w:t>
+          <w:t>8</w:t>
         </w:r>
         <w:r>
           <w:rPr>
@@ -2683,7 +2683,7 @@
           <w:lang w:val="es-MX" w:eastAsia="es-MX" w:bidi="ar-SA"/>
         </w:rPr>
       </w:pPr>
-      <w:hyperlink w:anchor="_Toc241766465" w:history="1">
+      <w:hyperlink w:anchor="_Toc241937930" w:history="1">
         <w:r>
           <w:rPr>
             <w:rStyle w:val="Hipervnculo"/>
@@ -2710,7 +2710,7 @@
             <w:noProof/>
             <w:webHidden/>
           </w:rPr>
-          <w:instrText xml:space="preserve"> PAGEREF _Toc241766465 \h </w:instrText>
+          <w:instrText xml:space="preserve"> PAGEREF _Toc241937930 \h </w:instrText>
         </w:r>
         <w:r>
           <w:rPr>
@@ -2730,7 +2730,7 @@
             <w:noProof/>
             <w:webHidden/>
           </w:rPr>
-          <w:t>9</w:t>
+          <w:t>8</w:t>
         </w:r>
         <w:r>
           <w:rPr>
@@ -2755,7 +2755,7 @@
           <w:lang w:val="es-MX" w:eastAsia="es-MX" w:bidi="ar-SA"/>
         </w:rPr>
       </w:pPr>
-      <w:hyperlink w:anchor="_Toc241766466" w:history="1">
+      <w:hyperlink w:anchor="_Toc241937931" w:history="1">
         <w:r>
           <w:rPr>
             <w:rStyle w:val="Hipervnculo"/>
@@ -2782,7 +2782,7 @@
             <w:noProof/>
             <w:webHidden/>
           </w:rPr>
-          <w:instrText xml:space="preserve"> PAGEREF _Toc241766466 \h </w:instrText>
+          <w:instrText xml:space="preserve"> PAGEREF _Toc241937931 \h </w:instrText>
         </w:r>
         <w:r>
           <w:rPr>
@@ -2802,7 +2802,7 @@
             <w:noProof/>
             <w:webHidden/>
           </w:rPr>
-          <w:t>10</w:t>
+          <w:t>9</w:t>
         </w:r>
         <w:r>
           <w:rPr>
@@ -2827,7 +2827,7 @@
           <w:lang w:val="es-MX" w:eastAsia="es-MX" w:bidi="ar-SA"/>
         </w:rPr>
       </w:pPr>
-      <w:hyperlink w:anchor="_Toc241766467" w:history="1">
+      <w:hyperlink w:anchor="_Toc241937932" w:history="1">
         <w:r>
           <w:rPr>
             <w:rStyle w:val="Hipervnculo"/>
@@ -2854,7 +2854,7 @@
             <w:noProof/>
             <w:webHidden/>
           </w:rPr>
-          <w:instrText xml:space="preserve"> PAGEREF _Toc241766467 \h </w:instrText>
+          <w:instrText xml:space="preserve"> PAGEREF _Toc241937932 \h </w:instrText>
         </w:r>
         <w:r>
           <w:rPr>
@@ -2874,7 +2874,7 @@
             <w:noProof/>
             <w:webHidden/>
           </w:rPr>
-          <w:t>10</w:t>
+          <w:t>9</w:t>
         </w:r>
         <w:r>
           <w:rPr>
@@ -2899,7 +2899,7 @@
           <w:lang w:val="es-MX" w:eastAsia="es-MX" w:bidi="ar-SA"/>
         </w:rPr>
       </w:pPr>
-      <w:hyperlink w:anchor="_Toc241766468" w:history="1">
+      <w:hyperlink w:anchor="_Toc241937933" w:history="1">
         <w:r>
           <w:rPr>
             <w:rStyle w:val="Hipervnculo"/>
@@ -2926,7 +2926,7 @@
             <w:noProof/>
             <w:webHidden/>
           </w:rPr>
-          <w:instrText xml:space="preserve"> PAGEREF _Toc241766468 \h </w:instrText>
+          <w:instrText xml:space="preserve"> PAGEREF _Toc241937933 \h </w:instrText>
         </w:r>
         <w:r>
           <w:rPr>
@@ -2946,7 +2946,7 @@
             <w:noProof/>
             <w:webHidden/>
           </w:rPr>
-          <w:t>11</w:t>
+          <w:t>10</w:t>
         </w:r>
         <w:r>
           <w:rPr>
@@ -2971,13 +2971,13 @@
           <w:lang w:val="es-MX" w:eastAsia="es-MX" w:bidi="ar-SA"/>
         </w:rPr>
       </w:pPr>
-      <w:hyperlink w:anchor="_Toc241766469" w:history="1">
+      <w:hyperlink w:anchor="_Toc241937934" w:history="1">
         <w:r>
           <w:rPr>
             <w:rStyle w:val="Hipervnculo"/>
             <w:noProof/>
           </w:rPr>
-          <w:t>Cartas definidas:</w:t>
+          <w:t>Cartas</w:t>
         </w:r>
         <w:r>
           <w:rPr>
@@ -2998,7 +2998,7 @@
             <w:noProof/>
             <w:webHidden/>
           </w:rPr>
-          <w:instrText xml:space="preserve"> PAGEREF _Toc241766469 \h </w:instrText>
+          <w:instrText xml:space="preserve"> PAGEREF _Toc241937934 \h </w:instrText>
         </w:r>
         <w:r>
           <w:rPr>
@@ -3043,7 +3043,7 @@
           <w:lang w:val="es-MX" w:eastAsia="es-MX" w:bidi="ar-SA"/>
         </w:rPr>
       </w:pPr>
-      <w:hyperlink w:anchor="_Toc241766470" w:history="1">
+      <w:hyperlink w:anchor="_Toc241937935" w:history="1">
         <w:r>
           <w:rPr>
             <w:rStyle w:val="Hipervnculo"/>
@@ -3071,7 +3071,7 @@
             <w:noProof/>
             <w:webHidden/>
           </w:rPr>
-          <w:instrText xml:space="preserve"> PAGEREF _Toc241766470 \h </w:instrText>
+          <w:instrText xml:space="preserve"> PAGEREF _Toc241937935 \h </w:instrText>
         </w:r>
         <w:r>
           <w:rPr>
@@ -3091,7 +3091,7 @@
             <w:noProof/>
             <w:webHidden/>
           </w:rPr>
-          <w:t>12</w:t>
+          <w:t>13</w:t>
         </w:r>
         <w:r>
           <w:rPr>
@@ -3116,7 +3116,7 @@
           <w:lang w:val="es-MX" w:eastAsia="es-MX" w:bidi="ar-SA"/>
         </w:rPr>
       </w:pPr>
-      <w:hyperlink w:anchor="_Toc241766471" w:history="1">
+      <w:hyperlink w:anchor="_Toc241937936" w:history="1">
         <w:r>
           <w:rPr>
             <w:rStyle w:val="Hipervnculo"/>
@@ -3144,7 +3144,7 @@
             <w:noProof/>
             <w:webHidden/>
           </w:rPr>
-          <w:instrText xml:space="preserve"> PAGEREF _Toc241766471 \h </w:instrText>
+          <w:instrText xml:space="preserve"> PAGEREF _Toc241937936 \h </w:instrText>
         </w:r>
         <w:r>
           <w:rPr>
@@ -3164,7 +3164,7 @@
             <w:noProof/>
             <w:webHidden/>
           </w:rPr>
-          <w:t>12</w:t>
+          <w:t>13</w:t>
         </w:r>
         <w:r>
           <w:rPr>
@@ -3189,7 +3189,7 @@
           <w:lang w:val="es-MX" w:eastAsia="es-MX" w:bidi="ar-SA"/>
         </w:rPr>
       </w:pPr>
-      <w:hyperlink w:anchor="_Toc241766472" w:history="1">
+      <w:hyperlink w:anchor="_Toc241937937" w:history="1">
         <w:r>
           <w:rPr>
             <w:rStyle w:val="Hipervnculo"/>
@@ -3216,7 +3216,7 @@
             <w:noProof/>
             <w:webHidden/>
           </w:rPr>
-          <w:instrText xml:space="preserve"> PAGEREF _Toc241766472 \h </w:instrText>
+          <w:instrText xml:space="preserve"> PAGEREF _Toc241937937 \h </w:instrText>
         </w:r>
         <w:r>
           <w:rPr>
@@ -3236,7 +3236,7 @@
             <w:noProof/>
             <w:webHidden/>
           </w:rPr>
-          <w:t>14</w:t>
+          <w:t>15</w:t>
         </w:r>
         <w:r>
           <w:rPr>
@@ -3261,7 +3261,7 @@
           <w:lang w:val="es-MX" w:eastAsia="es-MX" w:bidi="ar-SA"/>
         </w:rPr>
       </w:pPr>
-      <w:hyperlink w:anchor="_Toc241766473" w:history="1">
+      <w:hyperlink w:anchor="_Toc241937938" w:history="1">
         <w:r>
           <w:rPr>
             <w:rStyle w:val="Hipervnculo"/>
@@ -3289,7 +3289,7 @@
             <w:noProof/>
             <w:webHidden/>
           </w:rPr>
-          <w:instrText xml:space="preserve"> PAGEREF _Toc241766473 \h </w:instrText>
+          <w:instrText xml:space="preserve"> PAGEREF _Toc241937938 \h </w:instrText>
         </w:r>
         <w:r>
           <w:rPr>
@@ -3309,7 +3309,7 @@
             <w:noProof/>
             <w:webHidden/>
           </w:rPr>
-          <w:t>14</w:t>
+          <w:t>15</w:t>
         </w:r>
         <w:r>
           <w:rPr>
@@ -3334,7 +3334,7 @@
           <w:lang w:val="es-MX" w:eastAsia="es-MX" w:bidi="ar-SA"/>
         </w:rPr>
       </w:pPr>
-      <w:hyperlink w:anchor="_Toc241766474" w:history="1">
+      <w:hyperlink w:anchor="_Toc241937939" w:history="1">
         <w:r>
           <w:rPr>
             <w:rStyle w:val="Hipervnculo"/>
@@ -3388,7 +3388,7 @@
             <w:noProof/>
             <w:webHidden/>
           </w:rPr>
-          <w:instrText xml:space="preserve"> PAGEREF _Toc241766474 \h </w:instrText>
+          <w:instrText xml:space="preserve"> PAGEREF _Toc241937939 \h </w:instrText>
         </w:r>
         <w:r>
           <w:rPr>
@@ -3408,7 +3408,7 @@
             <w:noProof/>
             <w:webHidden/>
           </w:rPr>
-          <w:t>14</w:t>
+          <w:t>16</w:t>
         </w:r>
         <w:r>
           <w:rPr>
@@ -3433,7 +3433,7 @@
           <w:lang w:val="es-MX" w:eastAsia="es-MX" w:bidi="ar-SA"/>
         </w:rPr>
       </w:pPr>
-      <w:hyperlink w:anchor="_Toc241766475" w:history="1">
+      <w:hyperlink w:anchor="_Toc241937940" w:history="1">
         <w:r>
           <w:rPr>
             <w:rStyle w:val="Hipervnculo"/>
@@ -3487,7 +3487,7 @@
             <w:noProof/>
             <w:webHidden/>
           </w:rPr>
-          <w:instrText xml:space="preserve"> PAGEREF _Toc241766475 \h </w:instrText>
+          <w:instrText xml:space="preserve"> PAGEREF _Toc241937940 \h </w:instrText>
         </w:r>
         <w:r>
           <w:rPr>
@@ -3507,7 +3507,7 @@
             <w:noProof/>
             <w:webHidden/>
           </w:rPr>
-          <w:t>15</w:t>
+          <w:t>16</w:t>
         </w:r>
         <w:r>
           <w:rPr>
@@ -3532,7 +3532,7 @@
           <w:lang w:val="es-MX" w:eastAsia="es-MX" w:bidi="ar-SA"/>
         </w:rPr>
       </w:pPr>
-      <w:hyperlink w:anchor="_Toc241766476" w:history="1">
+      <w:hyperlink w:anchor="_Toc241937941" w:history="1">
         <w:r>
           <w:rPr>
             <w:rStyle w:val="Hipervnculo"/>
@@ -3578,7 +3578,7 @@
             <w:noProof/>
             <w:webHidden/>
           </w:rPr>
-          <w:instrText xml:space="preserve"> PAGEREF _Toc241766476 \h </w:instrText>
+          <w:instrText xml:space="preserve"> PAGEREF _Toc241937941 \h </w:instrText>
         </w:r>
         <w:r>
           <w:rPr>
@@ -3598,7 +3598,7 @@
             <w:noProof/>
             <w:webHidden/>
           </w:rPr>
-          <w:t>15</w:t>
+          <w:t>16</w:t>
         </w:r>
         <w:r>
           <w:rPr>
@@ -3623,7 +3623,7 @@
           <w:lang w:val="es-MX" w:eastAsia="es-MX" w:bidi="ar-SA"/>
         </w:rPr>
       </w:pPr>
-      <w:hyperlink w:anchor="_Toc241766477" w:history="1">
+      <w:hyperlink w:anchor="_Toc241937942" w:history="1">
         <w:r>
           <w:rPr>
             <w:rStyle w:val="Hipervnculo"/>
@@ -3650,7 +3650,7 @@
             <w:noProof/>
             <w:webHidden/>
           </w:rPr>
-          <w:instrText xml:space="preserve"> PAGEREF _Toc241766477 \h </w:instrText>
+          <w:instrText xml:space="preserve"> PAGEREF _Toc241937942 \h </w:instrText>
         </w:r>
         <w:r>
           <w:rPr>
@@ -3670,7 +3670,7 @@
             <w:noProof/>
             <w:webHidden/>
           </w:rPr>
-          <w:t>16</w:t>
+          <w:t>17</w:t>
         </w:r>
         <w:r>
           <w:rPr>
@@ -3759,7 +3759,7 @@
       <w:bookmarkStart w:id="0" w:name="_Toc223540990"/>
       <w:bookmarkStart w:id="1" w:name="_Toc238637806"/>
       <w:bookmarkStart w:id="2" w:name="_Toc241766315"/>
-      <w:bookmarkStart w:id="3" w:name="_Toc241766444"/>
+      <w:bookmarkStart w:id="3" w:name="_Toc241937909"/>
       <w:r>
         <w:t>Introducción</w:t>
       </w:r>
@@ -3846,7 +3846,7 @@
       <w:bookmarkStart w:id="5" w:name="_Toc223540992"/>
       <w:bookmarkStart w:id="6" w:name="_Toc238637807"/>
       <w:bookmarkStart w:id="7" w:name="_Toc241766316"/>
-      <w:bookmarkStart w:id="8" w:name="_Toc241766445"/>
+      <w:bookmarkStart w:id="8" w:name="_Toc241937910"/>
       <w:bookmarkEnd w:id="4"/>
       <w:r>
         <w:t>Marco Teórico</w:t>
@@ -3864,7 +3864,7 @@
         </w:rPr>
       </w:pPr>
       <w:bookmarkStart w:id="9" w:name="_Toc241766317"/>
-      <w:bookmarkStart w:id="10" w:name="_Toc241766446"/>
+      <w:bookmarkStart w:id="10" w:name="_Toc241937911"/>
       <w:r>
         <w:rPr>
           <w:lang w:val="es-MX" w:eastAsia="en-US" w:bidi="ar-SA"/>
@@ -4023,7 +4023,7 @@
         </w:rPr>
       </w:pPr>
       <w:bookmarkStart w:id="11" w:name="_Toc241766318"/>
-      <w:bookmarkStart w:id="12" w:name="_Toc241766447"/>
+      <w:bookmarkStart w:id="12" w:name="_Toc241937912"/>
       <w:r>
         <w:rPr>
           <w:lang w:val="es-MX" w:eastAsia="en-US" w:bidi="ar-SA"/>
@@ -4195,6 +4195,8 @@
         </w:rPr>
         <w:t>Evaluación</w:t>
       </w:r>
+      <w:bookmarkStart w:id="13" w:name="_GoBack"/>
+      <w:bookmarkEnd w:id="13"/>
     </w:p>
     <w:p>
       <w:pPr>
@@ -4269,16 +4271,16 @@
           <w:lang w:val="es-MX" w:eastAsia="en-US" w:bidi="ar-SA"/>
         </w:rPr>
       </w:pPr>
-      <w:bookmarkStart w:id="13" w:name="_Toc241766319"/>
-      <w:bookmarkStart w:id="14" w:name="_Toc241766448"/>
+      <w:bookmarkStart w:id="14" w:name="_Toc241766319"/>
+      <w:bookmarkStart w:id="15" w:name="_Toc241937913"/>
       <w:r>
         <w:rPr>
           <w:lang w:val="es-MX" w:eastAsia="en-US" w:bidi="ar-SA"/>
         </w:rPr>
         <w:t>Observación y descripción</w:t>
       </w:r>
-      <w:bookmarkEnd w:id="13"/>
       <w:bookmarkEnd w:id="14"/>
+      <w:bookmarkEnd w:id="15"/>
     </w:p>
     <w:p>
       <w:pPr>
@@ -4329,16 +4331,16 @@
           <w:lang w:val="es-MX" w:eastAsia="en-US" w:bidi="ar-SA"/>
         </w:rPr>
       </w:pPr>
-      <w:bookmarkStart w:id="15" w:name="_Toc241766320"/>
-      <w:bookmarkStart w:id="16" w:name="_Toc241766449"/>
+      <w:bookmarkStart w:id="16" w:name="_Toc241766320"/>
+      <w:bookmarkStart w:id="17" w:name="_Toc241937914"/>
       <w:r>
         <w:rPr>
           <w:lang w:val="es-MX" w:eastAsia="en-US" w:bidi="ar-SA"/>
         </w:rPr>
         <w:t>Comparación</w:t>
       </w:r>
-      <w:bookmarkEnd w:id="15"/>
       <w:bookmarkEnd w:id="16"/>
+      <w:bookmarkEnd w:id="17"/>
     </w:p>
     <w:p>
       <w:pPr>
@@ -4384,8 +4386,8 @@
           <w:lang w:val="es-MX" w:eastAsia="en-US" w:bidi="ar-SA"/>
         </w:rPr>
       </w:pPr>
-      <w:bookmarkStart w:id="17" w:name="_Toc241766321"/>
-      <w:bookmarkStart w:id="18" w:name="_Toc241766450"/>
+      <w:bookmarkStart w:id="18" w:name="_Toc241766321"/>
+      <w:bookmarkStart w:id="19" w:name="_Toc241937915"/>
       <w:r>
         <w:rPr>
           <w:lang w:val="es-MX" w:eastAsia="en-US" w:bidi="ar-SA"/>
@@ -4393,8 +4395,8 @@
         <w:lastRenderedPageBreak/>
         <w:t>Clasificación</w:t>
       </w:r>
-      <w:bookmarkEnd w:id="17"/>
       <w:bookmarkEnd w:id="18"/>
+      <w:bookmarkEnd w:id="19"/>
     </w:p>
     <w:p>
       <w:pPr>
@@ -4439,16 +4441,16 @@
           <w:lang w:val="es-MX" w:eastAsia="en-US" w:bidi="ar-SA"/>
         </w:rPr>
       </w:pPr>
-      <w:bookmarkStart w:id="19" w:name="_Toc241766322"/>
-      <w:bookmarkStart w:id="20" w:name="_Toc241766451"/>
+      <w:bookmarkStart w:id="20" w:name="_Toc241766322"/>
+      <w:bookmarkStart w:id="21" w:name="_Toc241937916"/>
       <w:r>
         <w:rPr>
           <w:lang w:val="es-MX" w:eastAsia="en-US" w:bidi="ar-SA"/>
         </w:rPr>
         <w:t>Definición</w:t>
       </w:r>
-      <w:bookmarkEnd w:id="19"/>
       <w:bookmarkEnd w:id="20"/>
+      <w:bookmarkEnd w:id="21"/>
     </w:p>
     <w:p>
       <w:pPr>
@@ -4479,16 +4481,16 @@
           <w:lang w:val="es-MX" w:eastAsia="en-US" w:bidi="ar-SA"/>
         </w:rPr>
       </w:pPr>
-      <w:bookmarkStart w:id="21" w:name="_Toc241766323"/>
-      <w:bookmarkStart w:id="22" w:name="_Toc241766452"/>
+      <w:bookmarkStart w:id="22" w:name="_Toc241766323"/>
+      <w:bookmarkStart w:id="23" w:name="_Toc241937917"/>
       <w:r>
         <w:rPr>
           <w:lang w:val="es-MX" w:eastAsia="en-US" w:bidi="ar-SA"/>
         </w:rPr>
         <w:t>Concepto</w:t>
       </w:r>
-      <w:bookmarkEnd w:id="21"/>
       <w:bookmarkEnd w:id="22"/>
+      <w:bookmarkEnd w:id="23"/>
     </w:p>
     <w:p>
       <w:pPr>
@@ -4519,16 +4521,16 @@
           <w:lang w:val="es-MX" w:eastAsia="en-US" w:bidi="ar-SA"/>
         </w:rPr>
       </w:pPr>
-      <w:bookmarkStart w:id="23" w:name="_Toc241766324"/>
-      <w:bookmarkStart w:id="24" w:name="_Toc241766453"/>
+      <w:bookmarkStart w:id="24" w:name="_Toc241766324"/>
+      <w:bookmarkStart w:id="25" w:name="_Toc241937918"/>
       <w:r>
         <w:rPr>
           <w:lang w:val="es-MX" w:eastAsia="en-US" w:bidi="ar-SA"/>
         </w:rPr>
         <w:t>Hipótesis</w:t>
       </w:r>
-      <w:bookmarkEnd w:id="23"/>
       <w:bookmarkEnd w:id="24"/>
+      <w:bookmarkEnd w:id="25"/>
     </w:p>
     <w:p>
       <w:pPr>
@@ -4559,16 +4561,16 @@
           <w:lang w:val="es-MX" w:eastAsia="en-US" w:bidi="ar-SA"/>
         </w:rPr>
       </w:pPr>
-      <w:bookmarkStart w:id="25" w:name="_Toc241766325"/>
-      <w:bookmarkStart w:id="26" w:name="_Toc241766454"/>
+      <w:bookmarkStart w:id="26" w:name="_Toc241766325"/>
+      <w:bookmarkStart w:id="27" w:name="_Toc241937919"/>
       <w:r>
         <w:rPr>
           <w:lang w:val="es-MX" w:eastAsia="en-US" w:bidi="ar-SA"/>
         </w:rPr>
         <w:t>Cambio y secuencias</w:t>
       </w:r>
-      <w:bookmarkEnd w:id="25"/>
       <w:bookmarkEnd w:id="26"/>
+      <w:bookmarkEnd w:id="27"/>
     </w:p>
     <w:p>
       <w:pPr>
@@ -4613,16 +4615,16 @@
           <w:lang w:val="es-MX" w:eastAsia="en-US" w:bidi="ar-SA"/>
         </w:rPr>
       </w:pPr>
-      <w:bookmarkStart w:id="27" w:name="_Toc241766326"/>
-      <w:bookmarkStart w:id="28" w:name="_Toc241766455"/>
+      <w:bookmarkStart w:id="28" w:name="_Toc241766326"/>
+      <w:bookmarkStart w:id="29" w:name="_Toc241937920"/>
       <w:r>
         <w:rPr>
           <w:lang w:val="es-MX" w:eastAsia="en-US" w:bidi="ar-SA"/>
         </w:rPr>
         <w:t>Análisis</w:t>
       </w:r>
-      <w:bookmarkEnd w:id="27"/>
       <w:bookmarkEnd w:id="28"/>
+      <w:bookmarkEnd w:id="29"/>
     </w:p>
     <w:p>
       <w:pPr>
@@ -4654,8 +4656,8 @@
           <w:lang w:val="es-MX" w:eastAsia="en-US" w:bidi="ar-SA"/>
         </w:rPr>
       </w:pPr>
-      <w:bookmarkStart w:id="29" w:name="_Toc241766327"/>
-      <w:bookmarkStart w:id="30" w:name="_Toc241766456"/>
+      <w:bookmarkStart w:id="30" w:name="_Toc241766327"/>
+      <w:bookmarkStart w:id="31" w:name="_Toc241937921"/>
       <w:r>
         <w:rPr>
           <w:lang w:val="es-MX" w:eastAsia="en-US" w:bidi="ar-SA"/>
@@ -4663,8 +4665,8 @@
         <w:lastRenderedPageBreak/>
         <w:t>Síntesis</w:t>
       </w:r>
-      <w:bookmarkEnd w:id="29"/>
       <w:bookmarkEnd w:id="30"/>
+      <w:bookmarkEnd w:id="31"/>
     </w:p>
     <w:p>
       <w:pPr>
@@ -4695,16 +4697,16 @@
           <w:lang w:val="es-MX" w:eastAsia="en-US" w:bidi="ar-SA"/>
         </w:rPr>
       </w:pPr>
-      <w:bookmarkStart w:id="31" w:name="_Toc241766328"/>
-      <w:bookmarkStart w:id="32" w:name="_Toc241766457"/>
+      <w:bookmarkStart w:id="32" w:name="_Toc241766328"/>
+      <w:bookmarkStart w:id="33" w:name="_Toc241937922"/>
       <w:r>
         <w:rPr>
           <w:lang w:val="es-MX" w:eastAsia="en-US" w:bidi="ar-SA"/>
         </w:rPr>
         <w:t>Evaluación</w:t>
       </w:r>
-      <w:bookmarkEnd w:id="31"/>
       <w:bookmarkEnd w:id="32"/>
+      <w:bookmarkEnd w:id="33"/>
     </w:p>
     <w:p>
       <w:pPr>
@@ -4735,16 +4737,16 @@
           <w:lang w:val="es-MX" w:eastAsia="en-US" w:bidi="ar-SA"/>
         </w:rPr>
       </w:pPr>
-      <w:bookmarkStart w:id="33" w:name="_Toc241766329"/>
-      <w:bookmarkStart w:id="34" w:name="_Toc241766458"/>
+      <w:bookmarkStart w:id="34" w:name="_Toc241766329"/>
+      <w:bookmarkStart w:id="35" w:name="_Toc241937923"/>
       <w:r>
         <w:rPr>
           <w:lang w:val="es-MX" w:eastAsia="en-US" w:bidi="ar-SA"/>
         </w:rPr>
         <w:t>Pensamiento crítico</w:t>
       </w:r>
-      <w:bookmarkEnd w:id="33"/>
       <w:bookmarkEnd w:id="34"/>
+      <w:bookmarkEnd w:id="35"/>
     </w:p>
     <w:p>
       <w:pPr>
@@ -4843,16 +4845,16 @@
           <w:lang w:val="es-MX" w:eastAsia="en-US" w:bidi="ar-SA"/>
         </w:rPr>
       </w:pPr>
-      <w:bookmarkStart w:id="35" w:name="_Toc241766330"/>
-      <w:bookmarkStart w:id="36" w:name="_Toc241766459"/>
+      <w:bookmarkStart w:id="36" w:name="_Toc241766330"/>
+      <w:bookmarkStart w:id="37" w:name="_Toc241937924"/>
       <w:r>
         <w:rPr>
           <w:lang w:val="es-MX" w:eastAsia="en-US" w:bidi="ar-SA"/>
         </w:rPr>
         <w:t>Falacias</w:t>
       </w:r>
-      <w:bookmarkEnd w:id="35"/>
       <w:bookmarkEnd w:id="36"/>
+      <w:bookmarkEnd w:id="37"/>
     </w:p>
     <w:p>
       <w:pPr>
@@ -4896,14 +4898,14 @@
         <w:pStyle w:val="A16T"/>
         <w:pageBreakBefore/>
       </w:pPr>
-      <w:bookmarkStart w:id="37" w:name="_Toc241766331"/>
-      <w:bookmarkStart w:id="38" w:name="_Toc241766460"/>
+      <w:bookmarkStart w:id="38" w:name="_Toc241766331"/>
+      <w:bookmarkStart w:id="39" w:name="_Toc241937925"/>
       <w:r>
         <w:lastRenderedPageBreak/>
         <w:t>Desarrollo</w:t>
       </w:r>
-      <w:bookmarkEnd w:id="37"/>
       <w:bookmarkEnd w:id="38"/>
+      <w:bookmarkEnd w:id="39"/>
     </w:p>
     <w:p>
       <w:pPr>
@@ -4960,16 +4962,16 @@
           <w:lang w:val="es-MX"/>
         </w:rPr>
       </w:pPr>
-      <w:bookmarkStart w:id="39" w:name="_Toc241766332"/>
-      <w:bookmarkStart w:id="40" w:name="_Toc241766461"/>
+      <w:bookmarkStart w:id="40" w:name="_Toc241766332"/>
+      <w:bookmarkStart w:id="41" w:name="_Toc241937926"/>
       <w:r>
         <w:rPr>
           <w:lang w:val="es-MX"/>
         </w:rPr>
         <w:t>Descripción de la Dinámica y solución</w:t>
       </w:r>
-      <w:bookmarkEnd w:id="39"/>
       <w:bookmarkEnd w:id="40"/>
+      <w:bookmarkEnd w:id="41"/>
     </w:p>
     <w:p>
       <w:pPr>
@@ -5099,16 +5101,16 @@
           <w:lang w:val="es-MX"/>
         </w:rPr>
       </w:pPr>
-      <w:bookmarkStart w:id="41" w:name="_Toc241766333"/>
-      <w:bookmarkStart w:id="42" w:name="_Toc241766462"/>
+      <w:bookmarkStart w:id="42" w:name="_Toc241766333"/>
+      <w:bookmarkStart w:id="43" w:name="_Toc241937927"/>
       <w:r>
         <w:rPr>
           <w:lang w:val="es-MX"/>
         </w:rPr>
         <w:t>Aplicación de la Dinámica en el grupo</w:t>
       </w:r>
-      <w:bookmarkEnd w:id="41"/>
       <w:bookmarkEnd w:id="42"/>
+      <w:bookmarkEnd w:id="43"/>
     </w:p>
     <w:p>
       <w:pPr>
@@ -5206,9 +5208,9 @@
           <w:lang w:val="es-MX"/>
         </w:rPr>
       </w:pPr>
-      <w:bookmarkStart w:id="43" w:name="_Toc241766334"/>
-      <w:bookmarkStart w:id="44" w:name="_Toc241766463"/>
+      <w:bookmarkStart w:id="44" w:name="_Toc241766334"/>
       <w:bookmarkStart w:id="45" w:name="_Toc238637810"/>
+      <w:bookmarkStart w:id="46" w:name="_Toc241937928"/>
       <w:r>
         <w:rPr>
           <w:lang w:val="es-MX"/>
@@ -5216,8 +5218,8 @@
         <w:lastRenderedPageBreak/>
         <w:t>Mouse Maestro</w:t>
       </w:r>
-      <w:bookmarkEnd w:id="43"/>
       <w:bookmarkEnd w:id="44"/>
+      <w:bookmarkEnd w:id="46"/>
     </w:p>
     <w:p>
       <w:pPr>
@@ -5239,11 +5241,11 @@
       <w:pPr>
         <w:pStyle w:val="A12T"/>
       </w:pPr>
-      <w:bookmarkStart w:id="46" w:name="_Toc241766464"/>
+      <w:bookmarkStart w:id="47" w:name="_Toc241937929"/>
       <w:r>
         <w:t>Reglas:</w:t>
       </w:r>
-      <w:bookmarkEnd w:id="46"/>
+      <w:bookmarkEnd w:id="47"/>
     </w:p>
     <w:p>
       <w:pPr>
@@ -5436,11 +5438,11 @@
       <w:pPr>
         <w:pStyle w:val="A12T"/>
       </w:pPr>
-      <w:bookmarkStart w:id="47" w:name="_Toc241766465"/>
+      <w:bookmarkStart w:id="48" w:name="_Toc241937930"/>
       <w:r>
         <w:t>Instrucciones:</w:t>
       </w:r>
-      <w:bookmarkEnd w:id="47"/>
+      <w:bookmarkEnd w:id="48"/>
     </w:p>
     <w:p>
       <w:pPr>
@@ -5607,12 +5609,12 @@
         <w:pStyle w:val="A12T"/>
         <w:pageBreakBefore/>
       </w:pPr>
-      <w:bookmarkStart w:id="48" w:name="_Toc241766466"/>
+      <w:bookmarkStart w:id="49" w:name="_Toc241937931"/>
       <w:r>
         <w:lastRenderedPageBreak/>
         <w:t>Tarjetas:</w:t>
       </w:r>
-      <w:bookmarkEnd w:id="48"/>
+      <w:bookmarkEnd w:id="49"/>
     </w:p>
     <w:tbl>
       <w:tblPr>
@@ -6364,11 +6366,11 @@
       <w:pPr>
         <w:pStyle w:val="A12T"/>
       </w:pPr>
-      <w:bookmarkStart w:id="49" w:name="_Toc241766467"/>
+      <w:bookmarkStart w:id="50" w:name="_Toc241937932"/>
       <w:r>
         <w:t>Jugadores:</w:t>
       </w:r>
-      <w:bookmarkEnd w:id="49"/>
+      <w:bookmarkEnd w:id="50"/>
     </w:p>
     <w:p>
       <w:pPr>
@@ -6393,12 +6395,12 @@
         <w:pStyle w:val="A12T"/>
         <w:pageBreakBefore/>
       </w:pPr>
-      <w:bookmarkStart w:id="50" w:name="_Toc241766468"/>
+      <w:bookmarkStart w:id="51" w:name="_Toc241937933"/>
       <w:r>
         <w:lastRenderedPageBreak/>
         <w:t>Medio de juego:</w:t>
       </w:r>
-      <w:bookmarkEnd w:id="50"/>
+      <w:bookmarkEnd w:id="51"/>
     </w:p>
     <w:p>
       <w:pPr>
@@ -6682,7 +6684,31 @@
         <w:rPr>
           <w:lang w:val="es-MX" w:eastAsia="en-US" w:bidi="ar-SA"/>
         </w:rPr>
-        <w:t xml:space="preserve">Para descargarlo, acceder al repositorio __________________, y descargar el archivo </w:t>
+        <w:t xml:space="preserve">Para descargarlo, acceder al repositorio </w:t>
+      </w:r>
+      <w:hyperlink r:id="rId10" w:history="1">
+        <w:r>
+          <w:rPr>
+            <w:rStyle w:val="Hipervnculo"/>
+            <w:lang w:val="es-MX" w:eastAsia="en-US" w:bidi="ar-SA"/>
+          </w:rPr>
+          <w:t>https://github.com/CO-EnriqueVega/Mouse_Master_personal_version</w:t>
+        </w:r>
+      </w:hyperlink>
+    </w:p>
+    <w:p>
+      <w:pPr>
+        <w:pStyle w:val="Arial12"/>
+        <w:ind w:left="1440"/>
+        <w:rPr>
+          <w:lang w:val="es-MX" w:eastAsia="en-US" w:bidi="ar-SA"/>
+        </w:rPr>
+      </w:pPr>
+      <w:r>
+        <w:rPr>
+          <w:lang w:val="es-MX" w:eastAsia="en-US" w:bidi="ar-SA"/>
+        </w:rPr>
+        <w:t xml:space="preserve">y descargar el archivo </w:t>
       </w:r>
       <w:r>
         <w:rPr>
@@ -6821,12 +6847,12 @@
         <w:pStyle w:val="A12T"/>
         <w:pageBreakBefore/>
       </w:pPr>
-      <w:bookmarkStart w:id="51" w:name="_Toc241766469"/>
+      <w:bookmarkStart w:id="52" w:name="_Toc241937934"/>
       <w:r>
         <w:lastRenderedPageBreak/>
         <w:t>Cartas</w:t>
       </w:r>
-      <w:bookmarkEnd w:id="51"/>
+      <w:bookmarkEnd w:id="52"/>
     </w:p>
     <w:p>
       <w:pPr>
@@ -7389,8 +7415,6 @@
         </w:rPr>
         <w:t>No se puede reírse.</w:t>
       </w:r>
-      <w:bookmarkStart w:id="52" w:name="_GoBack"/>
-      <w:bookmarkEnd w:id="52"/>
     </w:p>
     <w:p>
       <w:pPr>
@@ -7592,7 +7616,7 @@
         </w:rPr>
       </w:pPr>
       <w:bookmarkStart w:id="53" w:name="_Toc241766335"/>
-      <w:bookmarkStart w:id="54" w:name="_Toc241766470"/>
+      <w:bookmarkStart w:id="54" w:name="_Toc241937935"/>
       <w:r>
         <w:rPr>
           <w:lang w:val="es-MX"/>
@@ -7620,7 +7644,7 @@
           <w:numId w:val="20"/>
         </w:numPr>
       </w:pPr>
-      <w:hyperlink r:id="rId10" w:history="1">
+      <w:hyperlink r:id="rId11" w:history="1">
         <w:r>
           <w:rPr>
             <w:rStyle w:val="Hipervnculo"/>
@@ -7637,12 +7661,54 @@
           <w:numId w:val="20"/>
         </w:numPr>
       </w:pPr>
-      <w:hyperlink r:id="rId11" w:history="1">
+      <w:hyperlink r:id="rId12" w:history="1">
         <w:r>
           <w:rPr>
             <w:rStyle w:val="Hipervnculo"/>
           </w:rPr>
           <w:t>https://www.youtube.com/watch?v=NgCRdB6dy1s</w:t>
+        </w:r>
+      </w:hyperlink>
+    </w:p>
+    <w:p>
+      <w:pPr>
+        <w:pStyle w:val="Arial12"/>
+      </w:pPr>
+      <w:r>
+        <w:t>Video 2:</w:t>
+      </w:r>
+    </w:p>
+    <w:p>
+      <w:pPr>
+        <w:pStyle w:val="Arial12"/>
+        <w:numPr>
+          <w:ilvl w:val="0"/>
+          <w:numId w:val="33"/>
+        </w:numPr>
+      </w:pPr>
+      <w:hyperlink r:id="rId13" w:history="1">
+        <w:r>
+          <w:rPr>
+            <w:rStyle w:val="Hipervnculo"/>
+          </w:rPr>
+          <w:t>https://youtu.be/4-y4ZZvDWfc</w:t>
+        </w:r>
+      </w:hyperlink>
+    </w:p>
+    <w:p>
+      <w:pPr>
+        <w:pStyle w:val="Arial12"/>
+        <w:numPr>
+          <w:ilvl w:val="0"/>
+          <w:numId w:val="33"/>
+        </w:numPr>
+      </w:pPr>
+      <w:hyperlink r:id="rId14" w:history="1">
+        <w:r>
+          <w:rPr>
+            <w:rStyle w:val="Hipervnculo"/>
+          </w:rPr>
+          <w:t>https://www.youtube.com/watch?v=4-y4ZZvDWfc</w:t>
         </w:r>
       </w:hyperlink>
     </w:p>
@@ -7692,6 +7758,14 @@
           <w:numId w:val="24"/>
         </w:numPr>
       </w:pPr>
+      <w:hyperlink r:id="rId15" w:history="1">
+        <w:r>
+          <w:rPr>
+            <w:rStyle w:val="Hipervnculo"/>
+          </w:rPr>
+          <w:t>https://github.com/CO-EnriqueVega/Mouse_Master_personal_version</w:t>
+        </w:r>
+      </w:hyperlink>
     </w:p>
     <w:p>
       <w:pPr>
@@ -7707,7 +7781,7 @@
       </w:pPr>
       <w:bookmarkStart w:id="55" w:name="_Toc238637811"/>
       <w:bookmarkStart w:id="56" w:name="_Toc241766336"/>
-      <w:bookmarkStart w:id="57" w:name="_Toc241766471"/>
+      <w:bookmarkStart w:id="57" w:name="_Toc241937936"/>
       <w:r>
         <w:rPr>
           <w:lang w:val="es-MX"/>
@@ -7743,7 +7817,7 @@
                     <pic:cNvPicPr/>
                   </pic:nvPicPr>
                   <pic:blipFill>
-                    <a:blip r:embed="rId12"/>
+                    <a:blip r:embed="rId16"/>
                     <a:stretch>
                       <a:fillRect/>
                     </a:stretch>
@@ -7795,7 +7869,7 @@
                     <pic:cNvPicPr/>
                   </pic:nvPicPr>
                   <pic:blipFill>
-                    <a:blip r:embed="rId13"/>
+                    <a:blip r:embed="rId17"/>
                     <a:stretch>
                       <a:fillRect/>
                     </a:stretch>
@@ -7846,7 +7920,7 @@
                     <pic:cNvPicPr/>
                   </pic:nvPicPr>
                   <pic:blipFill>
-                    <a:blip r:embed="rId14"/>
+                    <a:blip r:embed="rId18"/>
                     <a:stretch>
                       <a:fillRect/>
                     </a:stretch>
@@ -7890,7 +7964,7 @@
       <w:bookmarkStart w:id="58" w:name="_Toc223540993"/>
       <w:bookmarkStart w:id="59" w:name="_Toc238637812"/>
       <w:bookmarkStart w:id="60" w:name="_Toc241766337"/>
-      <w:bookmarkStart w:id="61" w:name="_Toc241766472"/>
+      <w:bookmarkStart w:id="61" w:name="_Toc241937937"/>
       <w:r>
         <w:lastRenderedPageBreak/>
         <w:t>Conclusiones Individuales</w:t>
@@ -7920,7 +7994,7 @@
       <w:bookmarkStart w:id="62" w:name="_Toc223540994"/>
       <w:bookmarkStart w:id="63" w:name="_Toc238637813"/>
       <w:bookmarkStart w:id="64" w:name="_Toc241766338"/>
-      <w:bookmarkStart w:id="65" w:name="_Toc241766473"/>
+      <w:bookmarkStart w:id="65" w:name="_Toc241937938"/>
       <w:r>
         <w:rPr>
           <w:lang w:val="es-MX"/>
@@ -7979,7 +8053,7 @@
                           </pic:cNvPicPr>
                         </pic:nvPicPr>
                         <pic:blipFill>
-                          <a:blip r:embed="rId15">
+                          <a:blip r:embed="rId19">
                             <a:extLst>
                               <a:ext uri="{28A0092B-C50C-407E-A947-70E740481C1C}">
                                 <a14:useLocalDpi xmlns:a14="http://schemas.microsoft.com/office/drawing/2010/main" val="0"/>
@@ -8082,7 +8156,7 @@
       </w:pPr>
       <w:bookmarkStart w:id="66" w:name="_Toc238637815"/>
       <w:bookmarkStart w:id="67" w:name="_Toc241766339"/>
-      <w:bookmarkStart w:id="68" w:name="_Toc241766474"/>
+      <w:bookmarkStart w:id="68" w:name="_Toc241937939"/>
       <w:r>
         <w:rPr>
           <w:rFonts w:eastAsia="Calibri" w:cs="Arial"/>
@@ -8176,7 +8250,7 @@
                           </pic:cNvPicPr>
                         </pic:nvPicPr>
                         <pic:blipFill>
-                          <a:blip r:embed="rId16">
+                          <a:blip r:embed="rId20">
                             <a:extLst>
                               <a:ext uri="{28A0092B-C50C-407E-A947-70E740481C1C}">
                                 <a14:useLocalDpi xmlns:a14="http://schemas.microsoft.com/office/drawing/2010/main" val="0"/>
@@ -8256,7 +8330,7 @@
       </w:pPr>
       <w:bookmarkStart w:id="70" w:name="_Toc238637814"/>
       <w:bookmarkStart w:id="71" w:name="_Toc241766340"/>
-      <w:bookmarkStart w:id="72" w:name="_Toc241766475"/>
+      <w:bookmarkStart w:id="72" w:name="_Toc241937940"/>
       <w:r>
         <w:rPr>
           <w:rFonts w:eastAsia="Calibri" w:cs="Arial"/>
@@ -8347,7 +8421,7 @@
       </w:pPr>
       <w:bookmarkStart w:id="74" w:name="_Toc238637816"/>
       <w:bookmarkStart w:id="75" w:name="_Toc241766341"/>
-      <w:bookmarkStart w:id="76" w:name="_Toc241766476"/>
+      <w:bookmarkStart w:id="76" w:name="_Toc241937941"/>
       <w:r>
         <w:rPr>
           <w:rFonts w:eastAsia="Calibri" w:cs="Arial"/>
@@ -8441,7 +8515,7 @@
       <w:bookmarkStart w:id="78" w:name="_Toc223541001"/>
       <w:bookmarkStart w:id="79" w:name="_Toc238637817"/>
       <w:bookmarkStart w:id="80" w:name="_Toc241766342"/>
-      <w:bookmarkStart w:id="81" w:name="_Toc241766477"/>
+      <w:bookmarkStart w:id="81" w:name="_Toc241937942"/>
       <w:r>
         <w:lastRenderedPageBreak/>
         <w:t>Referencias (en formato APA)</w:t>
@@ -8485,7 +8559,7 @@
         </w:rPr>
         <w:t xml:space="preserve">YouTube. Recuperado 7 de septiembre de 2026, de </w:t>
       </w:r>
-      <w:hyperlink r:id="rId17" w:history="1">
+      <w:hyperlink r:id="rId21" w:history="1">
         <w:r>
           <w:rPr>
             <w:rStyle w:val="Hipervnculo"/>
@@ -8542,7 +8616,7 @@
         </w:rPr>
         <w:t xml:space="preserve">Gómez, M. I. (2024b, octubre 24). Pensamiento creativo - Qué es, fases, ejemplos, características. Concepto. </w:t>
       </w:r>
-      <w:hyperlink r:id="rId18" w:history="1">
+      <w:hyperlink r:id="rId22" w:history="1">
         <w:r>
           <w:rPr>
             <w:rStyle w:val="Hipervnculo"/>
@@ -8569,7 +8643,7 @@
         </w:rPr>
         <w:t xml:space="preserve">Carrillo, A. (2026b, enero 16). Pensamiento creativo: características y maneras de potenciarlo. Psicología y Mente. </w:t>
       </w:r>
-      <w:hyperlink r:id="rId19" w:history="1">
+      <w:hyperlink r:id="rId23" w:history="1">
         <w:r>
           <w:rPr>
             <w:rStyle w:val="Hipervnculo"/>
@@ -8626,7 +8700,7 @@
         </w:rPr>
         <w:t xml:space="preserve">Laedu. (2025, 14 agosto). Introducción El pensamiento es una habilidad fundamental para el ser humano, ya Leer más. Estudia En Línea. </w:t>
       </w:r>
-      <w:hyperlink r:id="rId20" w:history="1">
+      <w:hyperlink r:id="rId24" w:history="1">
         <w:r>
           <w:rPr>
             <w:rStyle w:val="Hipervnculo"/>
@@ -8683,7 +8757,7 @@
         </w:rPr>
         <w:t xml:space="preserve">Nueva Escuela Mexicana. (2026, 12 mayo). Qué es un concepto: definición, importancia y usos clave. </w:t>
       </w:r>
-      <w:hyperlink r:id="rId21" w:history="1">
+      <w:hyperlink r:id="rId25" w:history="1">
         <w:r>
           <w:rPr>
             <w:rStyle w:val="Hipervnculo"/>
@@ -8710,7 +8784,7 @@
         </w:rPr>
         <w:t xml:space="preserve">Arrieta, E. (2025, 11 junio). Diferencia entre concepto y definición: qué es y ejemplos. Diferenciador. </w:t>
       </w:r>
-      <w:hyperlink r:id="rId22" w:history="1">
+      <w:hyperlink r:id="rId26" w:history="1">
         <w:r>
           <w:rPr>
             <w:rStyle w:val="Hipervnculo"/>
@@ -8767,7 +8841,7 @@
         </w:rPr>
         <w:t xml:space="preserve">Castillero Mimenza, O. (2026, 6 mayo). ¿Qué es el pensamiento crítico y cómo desarrollarlo? Psicología y Mente. </w:t>
       </w:r>
-      <w:hyperlink r:id="rId23" w:history="1">
+      <w:hyperlink r:id="rId27" w:history="1">
         <w:r>
           <w:rPr>
             <w:rStyle w:val="Hipervnculo"/>
@@ -9425,6 +9499,119 @@
     </w:lvl>
   </w:abstractNum>
   <w:abstractNum w:abstractNumId="5" w15:restartNumberingAfterBreak="0">
+    <w:nsid w:val="19700630"/>
+    <w:multiLevelType w:val="hybridMultilevel"/>
+    <w:tmpl w:val="109C8E3A"/>
+    <w:lvl w:ilvl="0" w:tplc="04090001">
+      <w:start w:val="1"/>
+      <w:numFmt w:val="bullet"/>
+      <w:lvlText w:val=""/>
+      <w:lvlJc w:val="left"/>
+      <w:pPr>
+        <w:ind w:left="720" w:hanging="360"/>
+      </w:pPr>
+      <w:rPr>
+        <w:rFonts w:ascii="Symbol" w:hAnsi="Symbol" w:hint="default"/>
+      </w:rPr>
+    </w:lvl>
+    <w:lvl w:ilvl="1" w:tplc="080A0003" w:tentative="1">
+      <w:start w:val="1"/>
+      <w:numFmt w:val="bullet"/>
+      <w:lvlText w:val="o"/>
+      <w:lvlJc w:val="left"/>
+      <w:pPr>
+        <w:ind w:left="1440" w:hanging="360"/>
+      </w:pPr>
+      <w:rPr>
+        <w:rFonts w:ascii="Courier New" w:hAnsi="Courier New" w:cs="Courier New" w:hint="default"/>
+      </w:rPr>
+    </w:lvl>
+    <w:lvl w:ilvl="2" w:tplc="080A0005" w:tentative="1">
+      <w:start w:val="1"/>
+      <w:numFmt w:val="bullet"/>
+      <w:lvlText w:val=""/>
+      <w:lvlJc w:val="left"/>
+      <w:pPr>
+        <w:ind w:left="2160" w:hanging="360"/>
+      </w:pPr>
+      <w:rPr>
+        <w:rFonts w:ascii="Wingdings" w:hAnsi="Wingdings" w:hint="default"/>
+      </w:rPr>
+    </w:lvl>
+    <w:lvl w:ilvl="3" w:tplc="080A0001" w:tentative="1">
+      <w:start w:val="1"/>
+      <w:numFmt w:val="bullet"/>
+      <w:lvlText w:val=""/>
+      <w:lvlJc w:val="left"/>
+      <w:pPr>
+        <w:ind w:left="2880" w:hanging="360"/>
+      </w:pPr>
+      <w:rPr>
+        <w:rFonts w:ascii="Symbol" w:hAnsi="Symbol" w:hint="default"/>
+      </w:rPr>
+    </w:lvl>
+    <w:lvl w:ilvl="4" w:tplc="080A0003" w:tentative="1">
+      <w:start w:val="1"/>
+      <w:numFmt w:val="bullet"/>
+      <w:lvlText w:val="o"/>
+      <w:lvlJc w:val="left"/>
+      <w:pPr>
+        <w:ind w:left="3600" w:hanging="360"/>
+      </w:pPr>
+      <w:rPr>
+        <w:rFonts w:ascii="Courier New" w:hAnsi="Courier New" w:cs="Courier New" w:hint="default"/>
+      </w:rPr>
+    </w:lvl>
+    <w:lvl w:ilvl="5" w:tplc="080A0005" w:tentative="1">
+      <w:start w:val="1"/>
+      <w:numFmt w:val="bullet"/>
+      <w:lvlText w:val=""/>
+      <w:lvlJc w:val="left"/>
+      <w:pPr>
+        <w:ind w:left="4320" w:hanging="360"/>
+      </w:pPr>
+      <w:rPr>
+        <w:rFonts w:ascii="Wingdings" w:hAnsi="Wingdings" w:hint="default"/>
+      </w:rPr>
+    </w:lvl>
+    <w:lvl w:ilvl="6" w:tplc="080A0001" w:tentative="1">
+      <w:start w:val="1"/>
+      <w:numFmt w:val="bullet"/>
+      <w:lvlText w:val=""/>
+      <w:lvlJc w:val="left"/>
+      <w:pPr>
+        <w:ind w:left="5040" w:hanging="360"/>
+      </w:pPr>
+      <w:rPr>
+        <w:rFonts w:ascii="Symbol" w:hAnsi="Symbol" w:hint="default"/>
+      </w:rPr>
+    </w:lvl>
+    <w:lvl w:ilvl="7" w:tplc="080A0003" w:tentative="1">
+      <w:start w:val="1"/>
+      <w:numFmt w:val="bullet"/>
+      <w:lvlText w:val="o"/>
+      <w:lvlJc w:val="left"/>
+      <w:pPr>
+        <w:ind w:left="5760" w:hanging="360"/>
+      </w:pPr>
+      <w:rPr>
+        <w:rFonts w:ascii="Courier New" w:hAnsi="Courier New" w:cs="Courier New" w:hint="default"/>
+      </w:rPr>
+    </w:lvl>
+    <w:lvl w:ilvl="8" w:tplc="080A0005" w:tentative="1">
+      <w:start w:val="1"/>
+      <w:numFmt w:val="bullet"/>
+      <w:lvlText w:val=""/>
+      <w:lvlJc w:val="left"/>
+      <w:pPr>
+        <w:ind w:left="6480" w:hanging="360"/>
+      </w:pPr>
+      <w:rPr>
+        <w:rFonts w:ascii="Wingdings" w:hAnsi="Wingdings" w:hint="default"/>
+      </w:rPr>
+    </w:lvl>
+  </w:abstractNum>
+  <w:abstractNum w:abstractNumId="6" w15:restartNumberingAfterBreak="0">
     <w:nsid w:val="1AC23144"/>
     <w:multiLevelType w:val="hybridMultilevel"/>
     <w:tmpl w:val="DA78B062"/>
@@ -9510,7 +9697,7 @@
       </w:pPr>
     </w:lvl>
   </w:abstractNum>
-  <w:abstractNum w:abstractNumId="6" w15:restartNumberingAfterBreak="0">
+  <w:abstractNum w:abstractNumId="7" w15:restartNumberingAfterBreak="0">
     <w:nsid w:val="1D701702"/>
     <w:multiLevelType w:val="hybridMultilevel"/>
     <w:tmpl w:val="A5BCA18A"/>
@@ -9623,7 +9810,7 @@
       </w:rPr>
     </w:lvl>
   </w:abstractNum>
-  <w:abstractNum w:abstractNumId="7" w15:restartNumberingAfterBreak="0">
+  <w:abstractNum w:abstractNumId="8" w15:restartNumberingAfterBreak="0">
     <w:nsid w:val="208D6ECD"/>
     <w:multiLevelType w:val="multilevel"/>
     <w:tmpl w:val="037E3D42"/>
@@ -9736,7 +9923,7 @@
       </w:pPr>
     </w:lvl>
   </w:abstractNum>
-  <w:abstractNum w:abstractNumId="8" w15:restartNumberingAfterBreak="0">
+  <w:abstractNum w:abstractNumId="9" w15:restartNumberingAfterBreak="0">
     <w:nsid w:val="216C75AF"/>
     <w:multiLevelType w:val="multilevel"/>
     <w:tmpl w:val="2ADA4E10"/>
@@ -9885,7 +10072,7 @@
       </w:rPr>
     </w:lvl>
   </w:abstractNum>
-  <w:abstractNum w:abstractNumId="9" w15:restartNumberingAfterBreak="0">
+  <w:abstractNum w:abstractNumId="10" w15:restartNumberingAfterBreak="0">
     <w:nsid w:val="21D0679F"/>
     <w:multiLevelType w:val="hybridMultilevel"/>
     <w:tmpl w:val="11A41ECE"/>
@@ -9998,7 +10185,7 @@
       </w:rPr>
     </w:lvl>
   </w:abstractNum>
-  <w:abstractNum w:abstractNumId="10" w15:restartNumberingAfterBreak="0">
+  <w:abstractNum w:abstractNumId="11" w15:restartNumberingAfterBreak="0">
     <w:nsid w:val="2295712B"/>
     <w:multiLevelType w:val="hybridMultilevel"/>
     <w:tmpl w:val="9EBE830A"/>
@@ -10111,7 +10298,7 @@
       </w:rPr>
     </w:lvl>
   </w:abstractNum>
-  <w:abstractNum w:abstractNumId="11" w15:restartNumberingAfterBreak="0">
+  <w:abstractNum w:abstractNumId="12" w15:restartNumberingAfterBreak="0">
     <w:nsid w:val="25450742"/>
     <w:multiLevelType w:val="hybridMultilevel"/>
     <w:tmpl w:val="2AB61044"/>
@@ -10224,7 +10411,7 @@
       </w:rPr>
     </w:lvl>
   </w:abstractNum>
-  <w:abstractNum w:abstractNumId="12" w15:restartNumberingAfterBreak="0">
+  <w:abstractNum w:abstractNumId="13" w15:restartNumberingAfterBreak="0">
     <w:nsid w:val="257A7783"/>
     <w:multiLevelType w:val="multilevel"/>
     <w:tmpl w:val="64CA1F50"/>
@@ -10373,7 +10560,7 @@
       </w:rPr>
     </w:lvl>
   </w:abstractNum>
-  <w:abstractNum w:abstractNumId="13" w15:restartNumberingAfterBreak="0">
+  <w:abstractNum w:abstractNumId="14" w15:restartNumberingAfterBreak="0">
     <w:nsid w:val="29642755"/>
     <w:multiLevelType w:val="hybridMultilevel"/>
     <w:tmpl w:val="505AE0E8"/>
@@ -10459,7 +10646,7 @@
       </w:pPr>
     </w:lvl>
   </w:abstractNum>
-  <w:abstractNum w:abstractNumId="14" w15:restartNumberingAfterBreak="0">
+  <w:abstractNum w:abstractNumId="15" w15:restartNumberingAfterBreak="0">
     <w:nsid w:val="309A3C4F"/>
     <w:multiLevelType w:val="multilevel"/>
     <w:tmpl w:val="D9447FAC"/>
@@ -10572,7 +10759,7 @@
       </w:pPr>
     </w:lvl>
   </w:abstractNum>
-  <w:abstractNum w:abstractNumId="15" w15:restartNumberingAfterBreak="0">
+  <w:abstractNum w:abstractNumId="16" w15:restartNumberingAfterBreak="0">
     <w:nsid w:val="33EB76FE"/>
     <w:multiLevelType w:val="hybridMultilevel"/>
     <w:tmpl w:val="DA78B062"/>
@@ -10658,7 +10845,7 @@
       </w:pPr>
     </w:lvl>
   </w:abstractNum>
-  <w:abstractNum w:abstractNumId="16" w15:restartNumberingAfterBreak="0">
+  <w:abstractNum w:abstractNumId="17" w15:restartNumberingAfterBreak="0">
     <w:nsid w:val="413B2EA5"/>
     <w:multiLevelType w:val="hybridMultilevel"/>
     <w:tmpl w:val="49B06C5C"/>
@@ -10771,7 +10958,7 @@
       </w:rPr>
     </w:lvl>
   </w:abstractNum>
-  <w:abstractNum w:abstractNumId="17" w15:restartNumberingAfterBreak="0">
+  <w:abstractNum w:abstractNumId="18" w15:restartNumberingAfterBreak="0">
     <w:nsid w:val="453429B6"/>
     <w:multiLevelType w:val="hybridMultilevel"/>
     <w:tmpl w:val="C804D826"/>
@@ -10884,7 +11071,7 @@
       </w:rPr>
     </w:lvl>
   </w:abstractNum>
-  <w:abstractNum w:abstractNumId="18" w15:restartNumberingAfterBreak="0">
+  <w:abstractNum w:abstractNumId="19" w15:restartNumberingAfterBreak="0">
     <w:nsid w:val="49382889"/>
     <w:multiLevelType w:val="hybridMultilevel"/>
     <w:tmpl w:val="7FC418B2"/>
@@ -10970,7 +11157,7 @@
       </w:pPr>
     </w:lvl>
   </w:abstractNum>
-  <w:abstractNum w:abstractNumId="19" w15:restartNumberingAfterBreak="0">
+  <w:abstractNum w:abstractNumId="20" w15:restartNumberingAfterBreak="0">
     <w:nsid w:val="4957633C"/>
     <w:multiLevelType w:val="multilevel"/>
     <w:tmpl w:val="93DE47AA"/>
@@ -11119,7 +11306,7 @@
       </w:rPr>
     </w:lvl>
   </w:abstractNum>
-  <w:abstractNum w:abstractNumId="20" w15:restartNumberingAfterBreak="0">
+  <w:abstractNum w:abstractNumId="21" w15:restartNumberingAfterBreak="0">
     <w:nsid w:val="496446DC"/>
     <w:multiLevelType w:val="hybridMultilevel"/>
     <w:tmpl w:val="4704C958"/>
@@ -11232,7 +11419,7 @@
       </w:rPr>
     </w:lvl>
   </w:abstractNum>
-  <w:abstractNum w:abstractNumId="21" w15:restartNumberingAfterBreak="0">
+  <w:abstractNum w:abstractNumId="22" w15:restartNumberingAfterBreak="0">
     <w:nsid w:val="4E321759"/>
     <w:multiLevelType w:val="multilevel"/>
     <w:tmpl w:val="E12616BA"/>
@@ -11381,7 +11568,7 @@
       </w:rPr>
     </w:lvl>
   </w:abstractNum>
-  <w:abstractNum w:abstractNumId="22" w15:restartNumberingAfterBreak="0">
+  <w:abstractNum w:abstractNumId="23" w15:restartNumberingAfterBreak="0">
     <w:nsid w:val="54D82702"/>
     <w:multiLevelType w:val="hybridMultilevel"/>
     <w:tmpl w:val="764A6E24"/>
@@ -11467,7 +11654,7 @@
       </w:pPr>
     </w:lvl>
   </w:abstractNum>
-  <w:abstractNum w:abstractNumId="23" w15:restartNumberingAfterBreak="0">
+  <w:abstractNum w:abstractNumId="24" w15:restartNumberingAfterBreak="0">
     <w:nsid w:val="5FC02562"/>
     <w:multiLevelType w:val="multilevel"/>
     <w:tmpl w:val="BF98C04E"/>
@@ -11616,7 +11803,7 @@
       </w:rPr>
     </w:lvl>
   </w:abstractNum>
-  <w:abstractNum w:abstractNumId="24" w15:restartNumberingAfterBreak="0">
+  <w:abstractNum w:abstractNumId="25" w15:restartNumberingAfterBreak="0">
     <w:nsid w:val="63BD19DD"/>
     <w:multiLevelType w:val="hybridMultilevel"/>
     <w:tmpl w:val="E326C16A"/>
@@ -11729,7 +11916,7 @@
       </w:rPr>
     </w:lvl>
   </w:abstractNum>
-  <w:abstractNum w:abstractNumId="25" w15:restartNumberingAfterBreak="0">
+  <w:abstractNum w:abstractNumId="26" w15:restartNumberingAfterBreak="0">
     <w:nsid w:val="63C25B71"/>
     <w:multiLevelType w:val="multilevel"/>
     <w:tmpl w:val="81226872"/>
@@ -11869,7 +12056,7 @@
       </w:rPr>
     </w:lvl>
   </w:abstractNum>
-  <w:abstractNum w:abstractNumId="26" w15:restartNumberingAfterBreak="0">
+  <w:abstractNum w:abstractNumId="27" w15:restartNumberingAfterBreak="0">
     <w:nsid w:val="67B26197"/>
     <w:multiLevelType w:val="hybridMultilevel"/>
     <w:tmpl w:val="582E2EE8"/>
@@ -11982,7 +12169,7 @@
       </w:rPr>
     </w:lvl>
   </w:abstractNum>
-  <w:abstractNum w:abstractNumId="27" w15:restartNumberingAfterBreak="0">
+  <w:abstractNum w:abstractNumId="28" w15:restartNumberingAfterBreak="0">
     <w:nsid w:val="67EF129F"/>
     <w:multiLevelType w:val="hybridMultilevel"/>
     <w:tmpl w:val="03AAD8C8"/>
@@ -12095,7 +12282,7 @@
       </w:rPr>
     </w:lvl>
   </w:abstractNum>
-  <w:abstractNum w:abstractNumId="28" w15:restartNumberingAfterBreak="0">
+  <w:abstractNum w:abstractNumId="29" w15:restartNumberingAfterBreak="0">
     <w:nsid w:val="6A5468DD"/>
     <w:multiLevelType w:val="hybridMultilevel"/>
     <w:tmpl w:val="DA78B062"/>
@@ -12181,7 +12368,7 @@
       </w:pPr>
     </w:lvl>
   </w:abstractNum>
-  <w:abstractNum w:abstractNumId="29" w15:restartNumberingAfterBreak="0">
+  <w:abstractNum w:abstractNumId="30" w15:restartNumberingAfterBreak="0">
     <w:nsid w:val="6C9C7E5F"/>
     <w:multiLevelType w:val="hybridMultilevel"/>
     <w:tmpl w:val="AE9059C8"/>
@@ -12294,7 +12481,7 @@
       </w:rPr>
     </w:lvl>
   </w:abstractNum>
-  <w:abstractNum w:abstractNumId="30" w15:restartNumberingAfterBreak="0">
+  <w:abstractNum w:abstractNumId="31" w15:restartNumberingAfterBreak="0">
     <w:nsid w:val="739331EE"/>
     <w:multiLevelType w:val="hybridMultilevel"/>
     <w:tmpl w:val="37DC6B5C"/>
@@ -12407,7 +12594,7 @@
       </w:rPr>
     </w:lvl>
   </w:abstractNum>
-  <w:abstractNum w:abstractNumId="31" w15:restartNumberingAfterBreak="0">
+  <w:abstractNum w:abstractNumId="32" w15:restartNumberingAfterBreak="0">
     <w:nsid w:val="7D267EDD"/>
     <w:multiLevelType w:val="multilevel"/>
     <w:tmpl w:val="4CEED2E6"/>
@@ -12557,100 +12744,103 @@
     </w:lvl>
   </w:abstractNum>
   <w:num w:numId="1">
-    <w:abstractNumId w:val="25"/>
+    <w:abstractNumId w:val="26"/>
   </w:num>
   <w:num w:numId="2">
     <w:abstractNumId w:val="3"/>
   </w:num>
   <w:num w:numId="3">
+    <w:abstractNumId w:val="9"/>
+  </w:num>
+  <w:num w:numId="4">
     <w:abstractNumId w:val="8"/>
   </w:num>
-  <w:num w:numId="4">
-    <w:abstractNumId w:val="7"/>
-  </w:num>
   <w:num w:numId="5">
-    <w:abstractNumId w:val="21"/>
+    <w:abstractNumId w:val="22"/>
   </w:num>
   <w:num w:numId="6">
     <w:abstractNumId w:val="2"/>
   </w:num>
   <w:num w:numId="7">
-    <w:abstractNumId w:val="31"/>
+    <w:abstractNumId w:val="32"/>
   </w:num>
   <w:num w:numId="8">
-    <w:abstractNumId w:val="14"/>
+    <w:abstractNumId w:val="15"/>
   </w:num>
   <w:num w:numId="9">
+    <w:abstractNumId w:val="13"/>
+  </w:num>
+  <w:num w:numId="10">
+    <w:abstractNumId w:val="20"/>
+  </w:num>
+  <w:num w:numId="11">
+    <w:abstractNumId w:val="24"/>
+  </w:num>
+  <w:num w:numId="12">
     <w:abstractNumId w:val="12"/>
   </w:num>
-  <w:num w:numId="10">
-    <w:abstractNumId w:val="19"/>
+  <w:num w:numId="13">
+    <w:abstractNumId w:val="28"/>
   </w:num>
-  <w:num w:numId="11">
+  <w:num w:numId="14">
+    <w:abstractNumId w:val="18"/>
+  </w:num>
+  <w:num w:numId="15">
+    <w:abstractNumId w:val="25"/>
+  </w:num>
+  <w:num w:numId="16">
+    <w:abstractNumId w:val="10"/>
+  </w:num>
+  <w:num w:numId="17">
+    <w:abstractNumId w:val="11"/>
+  </w:num>
+  <w:num w:numId="18">
     <w:abstractNumId w:val="23"/>
   </w:num>
-  <w:num w:numId="12">
-    <w:abstractNumId w:val="11"/>
-  </w:num>
-  <w:num w:numId="13">
+  <w:num w:numId="19">
     <w:abstractNumId w:val="27"/>
   </w:num>
-  <w:num w:numId="14">
-    <w:abstractNumId w:val="17"/>
-  </w:num>
-  <w:num w:numId="15">
-    <w:abstractNumId w:val="24"/>
-  </w:num>
-  <w:num w:numId="16">
-    <w:abstractNumId w:val="9"/>
-  </w:num>
-  <w:num w:numId="17">
-    <w:abstractNumId w:val="10"/>
-  </w:num>
-  <w:num w:numId="18">
-    <w:abstractNumId w:val="22"/>
-  </w:num>
-  <w:num w:numId="19">
-    <w:abstractNumId w:val="26"/>
-  </w:num>
   <w:num w:numId="20">
-    <w:abstractNumId w:val="29"/>
+    <w:abstractNumId w:val="30"/>
   </w:num>
   <w:num w:numId="21">
     <w:abstractNumId w:val="0"/>
   </w:num>
   <w:num w:numId="22">
-    <w:abstractNumId w:val="16"/>
+    <w:abstractNumId w:val="17"/>
   </w:num>
   <w:num w:numId="23">
     <w:abstractNumId w:val="4"/>
   </w:num>
   <w:num w:numId="24">
-    <w:abstractNumId w:val="30"/>
+    <w:abstractNumId w:val="31"/>
   </w:num>
   <w:num w:numId="25">
     <w:abstractNumId w:val="1"/>
   </w:num>
   <w:num w:numId="26">
-    <w:abstractNumId w:val="20"/>
+    <w:abstractNumId w:val="21"/>
   </w:num>
   <w:num w:numId="27">
-    <w:abstractNumId w:val="28"/>
+    <w:abstractNumId w:val="29"/>
   </w:num>
   <w:num w:numId="28">
-    <w:abstractNumId w:val="5"/>
+    <w:abstractNumId w:val="6"/>
   </w:num>
   <w:num w:numId="29">
-    <w:abstractNumId w:val="15"/>
+    <w:abstractNumId w:val="16"/>
   </w:num>
   <w:num w:numId="30">
-    <w:abstractNumId w:val="13"/>
+    <w:abstractNumId w:val="14"/>
   </w:num>
   <w:num w:numId="31">
-    <w:abstractNumId w:val="18"/>
+    <w:abstractNumId w:val="19"/>
   </w:num>
   <w:num w:numId="32">
-    <w:abstractNumId w:val="6"/>
+    <w:abstractNumId w:val="7"/>
+  </w:num>
+  <w:num w:numId="33">
+    <w:abstractNumId w:val="5"/>
   </w:num>
 </w:numbering>
 </file>
@@ -13593,10 +13783,10 @@
   <a:themeElements>
     <a:clrScheme name="Office">
       <a:dk1>
-        <a:sysClr val="windowText" lastClr="FFFFFF"/>
+        <a:sysClr val="windowText" lastClr="000000"/>
       </a:dk1>
       <a:lt1>
-        <a:sysClr val="window" lastClr="000000"/>
+        <a:sysClr val="window" lastClr="FFFFFF"/>
       </a:lt1>
       <a:dk2>
         <a:srgbClr val="44546A"/>
@@ -13854,7 +14044,7 @@
 </file>
 
 <file path=customXml/itemProps1.xml><?xml version="1.0" encoding="utf-8"?>
-<ds:datastoreItem xmlns:ds="http://schemas.openxmlformats.org/officeDocument/2006/customXml" ds:itemID="{49373432-A13F-454F-A0B4-69AED74ACA17}">
+<ds:datastoreItem xmlns:ds="http://schemas.openxmlformats.org/officeDocument/2006/customXml" ds:itemID="{B37EEAC6-F2EE-4E54-B725-7339F9242FBB}">
   <ds:schemaRefs>
     <ds:schemaRef ds:uri="http://schemas.openxmlformats.org/officeDocument/2006/bibliography"/>
   </ds:schemaRefs>

</xml_diff>